<commit_message>
implemented inventory and item classes with spike report
</commit_message>
<xml_diff>
--- a/09 - Spike - Game Data Structures/Task 09 - Lab Spike Report.docx
+++ b/09 - Spike - Game Data Structures/Task 09 - Lab Spike Report.docx
@@ -231,8 +231,36 @@
           <w:sz w:val="24"/>
           <w:szCs w:val="24"/>
         </w:rPr>
-        <w:t>C:\Users\storm\Documents\GitHub\GAMES PROGRAMMING REPO\COS30031-2023-102608927\08 - Spike - Game State Management\Zorkish\Zorkish</w:t>
-      </w:r>
+        <w:t>C:\Users\storm\Documents\GitHub\GAMES PROGRAMMING REPO\COS30031-2023-102608927\08 - Spike - Game State Management\</w:t>
+      </w:r>
+      <w:proofErr w:type="spellStart"/>
+      <w:r>
+        <w:rPr>
+          <w:rStyle w:val="SubtleReference"/>
+          <w:sz w:val="24"/>
+          <w:szCs w:val="24"/>
+        </w:rPr>
+        <w:t>Zorkish</w:t>
+      </w:r>
+      <w:proofErr w:type="spellEnd"/>
+      <w:r>
+        <w:rPr>
+          <w:rStyle w:val="SubtleReference"/>
+          <w:sz w:val="24"/>
+          <w:szCs w:val="24"/>
+        </w:rPr>
+        <w:t>\</w:t>
+      </w:r>
+      <w:proofErr w:type="spellStart"/>
+      <w:r>
+        <w:rPr>
+          <w:rStyle w:val="SubtleReference"/>
+          <w:sz w:val="24"/>
+          <w:szCs w:val="24"/>
+        </w:rPr>
+        <w:t>Zorkish</w:t>
+      </w:r>
+      <w:proofErr w:type="spellEnd"/>
     </w:p>
     <w:p>
       <w:pPr>
@@ -600,7 +628,25 @@
           <w:sz w:val="24"/>
           <w:szCs w:val="24"/>
         </w:rPr>
-        <w:t>with a .cpp file to build.</w:t>
+        <w:t>with a .</w:t>
+      </w:r>
+      <w:proofErr w:type="spellStart"/>
+      <w:r>
+        <w:rPr>
+          <w:rStyle w:val="SubtleReference"/>
+          <w:sz w:val="24"/>
+          <w:szCs w:val="24"/>
+        </w:rPr>
+        <w:t>cpp</w:t>
+      </w:r>
+      <w:proofErr w:type="spellEnd"/>
+      <w:r>
+        <w:rPr>
+          <w:rStyle w:val="SubtleReference"/>
+          <w:sz w:val="24"/>
+          <w:szCs w:val="24"/>
+        </w:rPr>
+        <w:t xml:space="preserve"> file to build.</w:t>
       </w:r>
     </w:p>
     <w:p>
@@ -654,18 +700,6 @@
       <w:pPr>
         <w:pStyle w:val="ColorfulList-Accent11"/>
         <w:spacing w:line="360" w:lineRule="auto"/>
-        <w:ind w:left="360"/>
-        <w:rPr>
-          <w:rStyle w:val="SubtleReference"/>
-          <w:sz w:val="24"/>
-          <w:szCs w:val="24"/>
-        </w:rPr>
-      </w:pPr>
-    </w:p>
-    <w:p>
-      <w:pPr>
-        <w:pStyle w:val="ColorfulList-Accent11"/>
-        <w:spacing w:line="360" w:lineRule="auto"/>
         <w:ind w:left="0"/>
         <w:rPr>
           <w:color w:val="5A5A5A" w:themeColor="text1" w:themeTint="A5"/>
@@ -687,6 +721,7 @@
           <w:b/>
           <w:sz w:val="24"/>
         </w:rPr>
+        <w:lastRenderedPageBreak/>
         <w:t>What we found out:</w:t>
       </w:r>
     </w:p>
@@ -702,6 +737,7 @@
     <w:p>
       <w:pPr>
         <w:spacing w:line="360" w:lineRule="auto"/>
+        <w:jc w:val="both"/>
         <w:rPr>
           <w:b/>
           <w:color w:val="767171" w:themeColor="background2" w:themeShade="80"/>
@@ -711,22 +747,1059 @@
       </w:pPr>
       <w:r>
         <w:rPr>
+          <w:bCs/>
+          <w:noProof/>
+          <w:color w:val="000000" w:themeColor="text1"/>
+          <w:sz w:val="24"/>
+        </w:rPr>
+        <w:drawing>
+          <wp:anchor distT="0" distB="0" distL="114300" distR="114300" simplePos="0" relativeHeight="251658240" behindDoc="0" locked="0" layoutInCell="1" allowOverlap="1" wp14:anchorId="5273B91B" wp14:editId="17298A3C">
+            <wp:simplePos x="0" y="0"/>
+            <wp:positionH relativeFrom="margin">
+              <wp:posOffset>-648</wp:posOffset>
+            </wp:positionH>
+            <wp:positionV relativeFrom="paragraph">
+              <wp:posOffset>349250</wp:posOffset>
+            </wp:positionV>
+            <wp:extent cx="2907665" cy="2409825"/>
+            <wp:effectExtent l="0" t="0" r="6985" b="9525"/>
+            <wp:wrapSquare wrapText="bothSides"/>
+            <wp:docPr id="756581030" name="Picture 3"/>
+            <wp:cNvGraphicFramePr>
+              <a:graphicFrameLocks xmlns:a="http://schemas.openxmlformats.org/drawingml/2006/main" noChangeAspect="1"/>
+            </wp:cNvGraphicFramePr>
+            <a:graphic xmlns:a="http://schemas.openxmlformats.org/drawingml/2006/main">
+              <a:graphicData uri="http://schemas.openxmlformats.org/drawingml/2006/picture">
+                <pic:pic xmlns:pic="http://schemas.openxmlformats.org/drawingml/2006/picture">
+                  <pic:nvPicPr>
+                    <pic:cNvPr id="0" name="Picture 3"/>
+                    <pic:cNvPicPr>
+                      <a:picLocks noChangeAspect="1" noChangeArrowheads="1"/>
+                    </pic:cNvPicPr>
+                  </pic:nvPicPr>
+                  <pic:blipFill rotWithShape="1">
+                    <a:blip r:embed="rId7">
+                      <a:extLst>
+                        <a:ext uri="{28A0092B-C50C-407E-A947-70E740481C1C}">
+                          <a14:useLocalDpi xmlns:a14="http://schemas.microsoft.com/office/drawing/2010/main" val="0"/>
+                        </a:ext>
+                      </a:extLst>
+                    </a:blip>
+                    <a:srcRect l="7006" t="9454" r="7472" b="9626"/>
+                    <a:stretch/>
+                  </pic:blipFill>
+                  <pic:spPr bwMode="auto">
+                    <a:xfrm>
+                      <a:off x="0" y="0"/>
+                      <a:ext cx="2907665" cy="2409825"/>
+                    </a:xfrm>
+                    <a:prstGeom prst="rect">
+                      <a:avLst/>
+                    </a:prstGeom>
+                    <a:noFill/>
+                    <a:ln>
+                      <a:noFill/>
+                    </a:ln>
+                    <a:extLst>
+                      <a:ext uri="{53640926-AAD7-44D8-BBD7-CCE9431645EC}">
+                        <a14:shadowObscured xmlns:a14="http://schemas.microsoft.com/office/drawing/2010/main"/>
+                      </a:ext>
+                    </a:extLst>
+                  </pic:spPr>
+                </pic:pic>
+              </a:graphicData>
+            </a:graphic>
+            <wp14:sizeRelH relativeFrom="margin">
+              <wp14:pctWidth>0</wp14:pctWidth>
+            </wp14:sizeRelH>
+            <wp14:sizeRelV relativeFrom="margin">
+              <wp14:pctHeight>0</wp14:pctHeight>
+            </wp14:sizeRelV>
+          </wp:anchor>
+        </w:drawing>
+      </w:r>
+      <w:r>
+        <w:rPr>
+          <w:bCs/>
+          <w:noProof/>
+          <w:color w:val="000000" w:themeColor="text1"/>
+          <w:sz w:val="24"/>
+        </w:rPr>
+        <w:drawing>
+          <wp:anchor distT="0" distB="0" distL="114300" distR="114300" simplePos="0" relativeHeight="251659264" behindDoc="0" locked="0" layoutInCell="1" allowOverlap="1" wp14:anchorId="79FE928C" wp14:editId="60378146">
+            <wp:simplePos x="0" y="0"/>
+            <wp:positionH relativeFrom="margin">
+              <wp:align>right</wp:align>
+            </wp:positionH>
+            <wp:positionV relativeFrom="paragraph">
+              <wp:posOffset>358343</wp:posOffset>
+            </wp:positionV>
+            <wp:extent cx="3002915" cy="2421890"/>
+            <wp:effectExtent l="0" t="0" r="6985" b="0"/>
+            <wp:wrapSquare wrapText="bothSides"/>
+            <wp:docPr id="1449182652" name="Picture 1"/>
+            <wp:cNvGraphicFramePr>
+              <a:graphicFrameLocks xmlns:a="http://schemas.openxmlformats.org/drawingml/2006/main" noChangeAspect="1"/>
+            </wp:cNvGraphicFramePr>
+            <a:graphic xmlns:a="http://schemas.openxmlformats.org/drawingml/2006/main">
+              <a:graphicData uri="http://schemas.openxmlformats.org/drawingml/2006/picture">
+                <pic:pic xmlns:pic="http://schemas.openxmlformats.org/drawingml/2006/picture">
+                  <pic:nvPicPr>
+                    <pic:cNvPr id="0" name="Picture 1"/>
+                    <pic:cNvPicPr>
+                      <a:picLocks noChangeAspect="1" noChangeArrowheads="1"/>
+                    </pic:cNvPicPr>
+                  </pic:nvPicPr>
+                  <pic:blipFill rotWithShape="1">
+                    <a:blip r:embed="rId8">
+                      <a:extLst>
+                        <a:ext uri="{28A0092B-C50C-407E-A947-70E740481C1C}">
+                          <a14:useLocalDpi xmlns:a14="http://schemas.microsoft.com/office/drawing/2010/main" val="0"/>
+                        </a:ext>
+                      </a:extLst>
+                    </a:blip>
+                    <a:srcRect l="9504" t="10499" r="9465" b="13493"/>
+                    <a:stretch/>
+                  </pic:blipFill>
+                  <pic:spPr bwMode="auto">
+                    <a:xfrm>
+                      <a:off x="0" y="0"/>
+                      <a:ext cx="3002915" cy="2421890"/>
+                    </a:xfrm>
+                    <a:prstGeom prst="rect">
+                      <a:avLst/>
+                    </a:prstGeom>
+                    <a:noFill/>
+                    <a:ln>
+                      <a:noFill/>
+                    </a:ln>
+                    <a:extLst>
+                      <a:ext uri="{53640926-AAD7-44D8-BBD7-CCE9431645EC}">
+                        <a14:shadowObscured xmlns:a14="http://schemas.microsoft.com/office/drawing/2010/main"/>
+                      </a:ext>
+                    </a:extLst>
+                  </pic:spPr>
+                </pic:pic>
+              </a:graphicData>
+            </a:graphic>
+          </wp:anchor>
+        </w:drawing>
+      </w:r>
+      <w:r>
+        <w:rPr>
           <w:b/>
           <w:color w:val="767171" w:themeColor="background2" w:themeShade="80"/>
           <w:sz w:val="28"/>
           <w:szCs w:val="28"/>
         </w:rPr>
-        <w:t xml:space="preserve">Planning Phase: </w:t>
+        <w:t>Implementing Inventory System</w:t>
       </w:r>
     </w:p>
     <w:p>
       <w:pPr>
         <w:spacing w:line="360" w:lineRule="auto"/>
         <w:jc w:val="both"/>
-      </w:pPr>
+        <w:rPr>
+          <w:bCs/>
+          <w:noProof/>
+          <w:color w:val="000000" w:themeColor="text1"/>
+          <w:sz w:val="24"/>
+        </w:rPr>
+      </w:pPr>
+    </w:p>
+    <w:p>
+      <w:pPr>
+        <w:spacing w:line="360" w:lineRule="auto"/>
+        <w:jc w:val="both"/>
+        <w:rPr>
+          <w:bCs/>
+          <w:noProof/>
+          <w:color w:val="000000" w:themeColor="text1"/>
+          <w:sz w:val="24"/>
+          <w:lang w:val="en-US"/>
+        </w:rPr>
+      </w:pPr>
+      <w:r>
+        <w:rPr>
+          <w:bCs/>
+          <w:noProof/>
+          <w:color w:val="000000" w:themeColor="text1"/>
+          <w:sz w:val="24"/>
+          <w:lang w:val="en-US"/>
+        </w:rPr>
+        <w:t xml:space="preserve">The Inventory class serves as the backbone for </w:t>
+      </w:r>
+      <w:r>
+        <w:rPr>
+          <w:bCs/>
+          <w:noProof/>
+          <w:color w:val="000000" w:themeColor="text1"/>
+          <w:sz w:val="24"/>
+          <w:lang w:val="en-US"/>
+        </w:rPr>
+        <w:t>the inventory</w:t>
+      </w:r>
+      <w:r>
+        <w:rPr>
+          <w:bCs/>
+          <w:noProof/>
+          <w:color w:val="000000" w:themeColor="text1"/>
+          <w:sz w:val="24"/>
+          <w:lang w:val="en-US"/>
+        </w:rPr>
+        <w:t xml:space="preserve"> system. </w:t>
+      </w:r>
+      <w:r>
+        <w:rPr>
+          <w:bCs/>
+          <w:noProof/>
+          <w:color w:val="000000" w:themeColor="text1"/>
+          <w:sz w:val="24"/>
+          <w:lang w:val="en-US"/>
+        </w:rPr>
+        <w:t xml:space="preserve">As the </w:t>
+      </w:r>
+      <w:r>
+        <w:rPr>
+          <w:bCs/>
+          <w:noProof/>
+          <w:color w:val="000000" w:themeColor="text1"/>
+          <w:sz w:val="24"/>
+          <w:lang w:val="en-US"/>
+        </w:rPr>
+        <w:t>class is fundamentally designed to store, manage, and retrieve items that a player might possess during the gameplay.</w:t>
+      </w:r>
+    </w:p>
+    <w:p>
+      <w:pPr>
+        <w:spacing w:line="360" w:lineRule="auto"/>
+        <w:jc w:val="both"/>
+        <w:rPr>
+          <w:bCs/>
+          <w:noProof/>
+          <w:color w:val="000000" w:themeColor="text1"/>
+          <w:sz w:val="24"/>
+          <w:lang w:val="en-US"/>
+        </w:rPr>
+      </w:pPr>
+      <w:r>
+        <w:rPr>
+          <w:b/>
+          <w:bCs/>
+          <w:noProof/>
+          <w:color w:val="000000" w:themeColor="text1"/>
+          <w:sz w:val="24"/>
+          <w:lang w:val="en-US"/>
+        </w:rPr>
+        <w:t xml:space="preserve">Inventory </w:t>
+      </w:r>
+      <w:r>
+        <w:rPr>
+          <w:b/>
+          <w:bCs/>
+          <w:noProof/>
+          <w:color w:val="000000" w:themeColor="text1"/>
+          <w:sz w:val="24"/>
+          <w:lang w:val="en-US"/>
+        </w:rPr>
+        <w:t>Header</w:t>
+      </w:r>
+      <w:r>
+        <w:rPr>
+          <w:b/>
+          <w:bCs/>
+          <w:noProof/>
+          <w:color w:val="000000" w:themeColor="text1"/>
+          <w:sz w:val="24"/>
+          <w:lang w:val="en-US"/>
+        </w:rPr>
+        <w:t xml:space="preserve"> File </w:t>
+      </w:r>
+      <w:r>
+        <w:rPr>
+          <w:b/>
+          <w:bCs/>
+          <w:noProof/>
+          <w:color w:val="000000" w:themeColor="text1"/>
+          <w:sz w:val="24"/>
+          <w:lang w:val="en-US"/>
+        </w:rPr>
+        <w:t>:</w:t>
+      </w:r>
+      <w:r>
+        <w:rPr>
+          <w:bCs/>
+          <w:noProof/>
+          <w:color w:val="000000" w:themeColor="text1"/>
+          <w:sz w:val="24"/>
+          <w:lang w:val="en-US"/>
+        </w:rPr>
+        <w:t xml:space="preserve"> the header file for the Inventory class, </w:t>
+      </w:r>
+      <w:r>
+        <w:rPr>
+          <w:bCs/>
+          <w:noProof/>
+          <w:color w:val="000000" w:themeColor="text1"/>
+          <w:sz w:val="24"/>
+          <w:lang w:val="en-US"/>
+        </w:rPr>
+        <w:t>we</w:t>
+      </w:r>
+      <w:r>
+        <w:rPr>
+          <w:bCs/>
+          <w:noProof/>
+          <w:color w:val="000000" w:themeColor="text1"/>
+          <w:sz w:val="24"/>
+          <w:lang w:val="en-US"/>
+        </w:rPr>
+        <w:t xml:space="preserve"> declare</w:t>
+      </w:r>
+      <w:r>
+        <w:rPr>
+          <w:bCs/>
+          <w:noProof/>
+          <w:color w:val="000000" w:themeColor="text1"/>
+          <w:sz w:val="24"/>
+          <w:lang w:val="en-US"/>
+        </w:rPr>
+        <w:t>d</w:t>
+      </w:r>
+      <w:r>
+        <w:rPr>
+          <w:bCs/>
+          <w:noProof/>
+          <w:color w:val="000000" w:themeColor="text1"/>
+          <w:sz w:val="24"/>
+          <w:lang w:val="en-US"/>
+        </w:rPr>
+        <w:t xml:space="preserve"> the methods and properties associated with the inventory. Some of the primary methods </w:t>
+      </w:r>
+      <w:r>
+        <w:rPr>
+          <w:bCs/>
+          <w:noProof/>
+          <w:color w:val="000000" w:themeColor="text1"/>
+          <w:sz w:val="24"/>
+          <w:lang w:val="en-US"/>
+        </w:rPr>
+        <w:t>such as</w:t>
+      </w:r>
+      <w:r>
+        <w:rPr>
+          <w:bCs/>
+          <w:noProof/>
+          <w:color w:val="000000" w:themeColor="text1"/>
+          <w:sz w:val="24"/>
+          <w:lang w:val="en-US"/>
+        </w:rPr>
+        <w:t>:</w:t>
+      </w:r>
+    </w:p>
+    <w:p>
+      <w:pPr>
+        <w:numPr>
+          <w:ilvl w:val="0"/>
+          <w:numId w:val="4"/>
+        </w:numPr>
+        <w:spacing w:line="360" w:lineRule="auto"/>
+        <w:jc w:val="both"/>
+        <w:rPr>
+          <w:bCs/>
+          <w:noProof/>
+          <w:color w:val="000000" w:themeColor="text1"/>
+          <w:sz w:val="24"/>
+          <w:lang w:val="en-US"/>
+        </w:rPr>
+      </w:pPr>
+      <w:r>
+        <w:rPr>
+          <w:b/>
+          <w:bCs/>
+          <w:noProof/>
+          <w:color w:val="000000" w:themeColor="text1"/>
+          <w:sz w:val="24"/>
+          <w:lang w:val="en-US"/>
+        </w:rPr>
+        <w:t>addItem(Item)</w:t>
+      </w:r>
+      <w:r>
+        <w:rPr>
+          <w:bCs/>
+          <w:noProof/>
+          <w:color w:val="000000" w:themeColor="text1"/>
+          <w:sz w:val="24"/>
+          <w:lang w:val="en-US"/>
+        </w:rPr>
+        <w:t xml:space="preserve">: </w:t>
+      </w:r>
+      <w:r>
+        <w:rPr>
+          <w:bCs/>
+          <w:noProof/>
+          <w:color w:val="000000" w:themeColor="text1"/>
+          <w:sz w:val="24"/>
+          <w:lang w:val="en-US"/>
+        </w:rPr>
+        <w:t>that</w:t>
+      </w:r>
+      <w:r>
+        <w:rPr>
+          <w:bCs/>
+          <w:noProof/>
+          <w:color w:val="000000" w:themeColor="text1"/>
+          <w:sz w:val="24"/>
+          <w:lang w:val="en-US"/>
+        </w:rPr>
+        <w:t xml:space="preserve"> add</w:t>
+      </w:r>
+      <w:r>
+        <w:rPr>
+          <w:bCs/>
+          <w:noProof/>
+          <w:color w:val="000000" w:themeColor="text1"/>
+          <w:sz w:val="24"/>
+          <w:lang w:val="en-US"/>
+        </w:rPr>
+        <w:t>s</w:t>
+      </w:r>
+      <w:r>
+        <w:rPr>
+          <w:bCs/>
+          <w:noProof/>
+          <w:color w:val="000000" w:themeColor="text1"/>
+          <w:sz w:val="24"/>
+          <w:lang w:val="en-US"/>
+        </w:rPr>
+        <w:t xml:space="preserve"> an item to the inventory.</w:t>
+      </w:r>
+    </w:p>
+    <w:p>
+      <w:pPr>
+        <w:numPr>
+          <w:ilvl w:val="0"/>
+          <w:numId w:val="4"/>
+        </w:numPr>
+        <w:spacing w:line="360" w:lineRule="auto"/>
+        <w:jc w:val="both"/>
+        <w:rPr>
+          <w:bCs/>
+          <w:noProof/>
+          <w:color w:val="000000" w:themeColor="text1"/>
+          <w:sz w:val="24"/>
+          <w:lang w:val="en-US"/>
+        </w:rPr>
+      </w:pPr>
+      <w:r>
+        <w:rPr>
+          <w:b/>
+          <w:bCs/>
+          <w:noProof/>
+          <w:color w:val="000000" w:themeColor="text1"/>
+          <w:sz w:val="24"/>
+          <w:lang w:val="en-US"/>
+        </w:rPr>
+        <w:t>removeItem(Item)</w:t>
+      </w:r>
+      <w:r>
+        <w:rPr>
+          <w:bCs/>
+          <w:noProof/>
+          <w:color w:val="000000" w:themeColor="text1"/>
+          <w:sz w:val="24"/>
+          <w:lang w:val="en-US"/>
+        </w:rPr>
+        <w:t xml:space="preserve">: </w:t>
+      </w:r>
+      <w:r>
+        <w:rPr>
+          <w:bCs/>
+          <w:noProof/>
+          <w:color w:val="000000" w:themeColor="text1"/>
+          <w:sz w:val="24"/>
+          <w:lang w:val="en-US"/>
+        </w:rPr>
+        <w:t>that</w:t>
+      </w:r>
+      <w:r>
+        <w:rPr>
+          <w:bCs/>
+          <w:noProof/>
+          <w:color w:val="000000" w:themeColor="text1"/>
+          <w:sz w:val="24"/>
+          <w:lang w:val="en-US"/>
+        </w:rPr>
+        <w:t xml:space="preserve"> remove</w:t>
+      </w:r>
+      <w:r>
+        <w:rPr>
+          <w:bCs/>
+          <w:noProof/>
+          <w:color w:val="000000" w:themeColor="text1"/>
+          <w:sz w:val="24"/>
+          <w:lang w:val="en-US"/>
+        </w:rPr>
+        <w:t>s</w:t>
+      </w:r>
+      <w:r>
+        <w:rPr>
+          <w:bCs/>
+          <w:noProof/>
+          <w:color w:val="000000" w:themeColor="text1"/>
+          <w:sz w:val="24"/>
+          <w:lang w:val="en-US"/>
+        </w:rPr>
+        <w:t xml:space="preserve"> a specific item from the inventory.</w:t>
+      </w:r>
+    </w:p>
+    <w:p>
+      <w:pPr>
+        <w:numPr>
+          <w:ilvl w:val="0"/>
+          <w:numId w:val="4"/>
+        </w:numPr>
+        <w:spacing w:line="360" w:lineRule="auto"/>
+        <w:jc w:val="both"/>
+        <w:rPr>
+          <w:bCs/>
+          <w:noProof/>
+          <w:color w:val="000000" w:themeColor="text1"/>
+          <w:sz w:val="24"/>
+          <w:lang w:val="en-US"/>
+        </w:rPr>
+      </w:pPr>
+      <w:r>
+        <w:rPr>
+          <w:b/>
+          <w:bCs/>
+          <w:noProof/>
+          <w:color w:val="000000" w:themeColor="text1"/>
+          <w:sz w:val="24"/>
+          <w:lang w:val="en-US"/>
+        </w:rPr>
+        <w:t>displayItems()</w:t>
+      </w:r>
+      <w:r>
+        <w:rPr>
+          <w:bCs/>
+          <w:noProof/>
+          <w:color w:val="000000" w:themeColor="text1"/>
+          <w:sz w:val="24"/>
+          <w:lang w:val="en-US"/>
+        </w:rPr>
+        <w:t xml:space="preserve">: </w:t>
+      </w:r>
+      <w:r>
+        <w:rPr>
+          <w:bCs/>
+          <w:noProof/>
+          <w:color w:val="000000" w:themeColor="text1"/>
+          <w:sz w:val="24"/>
+          <w:lang w:val="en-US"/>
+        </w:rPr>
+        <w:t>that displays</w:t>
+      </w:r>
+      <w:r>
+        <w:rPr>
+          <w:bCs/>
+          <w:noProof/>
+          <w:color w:val="000000" w:themeColor="text1"/>
+          <w:sz w:val="24"/>
+          <w:lang w:val="en-US"/>
+        </w:rPr>
+        <w:t xml:space="preserve"> all the items currently held in the inventory.</w:t>
+      </w:r>
+    </w:p>
+    <w:p>
+      <w:pPr>
+        <w:spacing w:line="360" w:lineRule="auto"/>
+        <w:jc w:val="both"/>
+        <w:rPr>
+          <w:bCs/>
+          <w:noProof/>
+          <w:color w:val="000000" w:themeColor="text1"/>
+          <w:sz w:val="24"/>
+          <w:lang w:val="en-US"/>
+        </w:rPr>
+      </w:pPr>
+      <w:r>
+        <w:rPr>
+          <w:bCs/>
+          <w:noProof/>
+          <w:color w:val="000000" w:themeColor="text1"/>
+          <w:sz w:val="24"/>
+          <w:lang w:val="en-US"/>
+        </w:rPr>
+        <w:t xml:space="preserve">To store the items, we use a </w:t>
+      </w:r>
+      <w:r>
+        <w:rPr>
+          <w:b/>
+          <w:bCs/>
+          <w:noProof/>
+          <w:color w:val="000000" w:themeColor="text1"/>
+          <w:sz w:val="24"/>
+          <w:lang w:val="en-US"/>
+        </w:rPr>
+        <w:t>std::vector</w:t>
+      </w:r>
+      <w:r>
+        <w:rPr>
+          <w:bCs/>
+          <w:noProof/>
+          <w:color w:val="000000" w:themeColor="text1"/>
+          <w:sz w:val="24"/>
+          <w:lang w:val="en-US"/>
+        </w:rPr>
+        <w:t xml:space="preserve"> data structure </w:t>
+      </w:r>
+      <w:r>
+        <w:rPr>
+          <w:bCs/>
+          <w:noProof/>
+          <w:color w:val="000000" w:themeColor="text1"/>
+          <w:sz w:val="24"/>
+          <w:lang w:val="en-US"/>
+        </w:rPr>
+        <w:t>as this</w:t>
+      </w:r>
+      <w:r>
+        <w:rPr>
+          <w:bCs/>
+          <w:noProof/>
+          <w:color w:val="000000" w:themeColor="text1"/>
+          <w:sz w:val="24"/>
+          <w:lang w:val="en-US"/>
+        </w:rPr>
+        <w:t xml:space="preserve"> data structure </w:t>
+      </w:r>
+      <w:r>
+        <w:rPr>
+          <w:bCs/>
+          <w:noProof/>
+          <w:color w:val="000000" w:themeColor="text1"/>
+          <w:sz w:val="24"/>
+          <w:lang w:val="en-US"/>
+        </w:rPr>
+        <w:t>was</w:t>
+      </w:r>
+      <w:r>
+        <w:rPr>
+          <w:bCs/>
+          <w:noProof/>
+          <w:color w:val="000000" w:themeColor="text1"/>
+          <w:sz w:val="24"/>
+          <w:lang w:val="en-US"/>
+        </w:rPr>
+        <w:t xml:space="preserve"> chosen due to its efficiency in appending and accessing elements, particularly if the order of items is significant.</w:t>
+      </w:r>
+    </w:p>
+    <w:p>
+      <w:pPr>
+        <w:spacing w:line="360" w:lineRule="auto"/>
+        <w:jc w:val="both"/>
+        <w:rPr>
+          <w:bCs/>
+          <w:noProof/>
+          <w:color w:val="000000" w:themeColor="text1"/>
+          <w:sz w:val="24"/>
+        </w:rPr>
+      </w:pPr>
+    </w:p>
+    <w:p>
+      <w:pPr>
+        <w:spacing w:line="360" w:lineRule="auto"/>
+        <w:jc w:val="both"/>
+        <w:rPr>
+          <w:bCs/>
+          <w:noProof/>
+          <w:color w:val="000000" w:themeColor="text1"/>
+          <w:sz w:val="24"/>
+        </w:rPr>
+      </w:pPr>
+    </w:p>
+    <w:p>
+      <w:pPr>
+        <w:spacing w:line="360" w:lineRule="auto"/>
+        <w:jc w:val="both"/>
+        <w:rPr>
+          <w:bCs/>
+          <w:color w:val="000000" w:themeColor="text1"/>
+          <w:sz w:val="24"/>
+        </w:rPr>
+      </w:pPr>
+    </w:p>
+    <w:p>
+      <w:pPr>
+        <w:spacing w:line="360" w:lineRule="auto"/>
+        <w:jc w:val="both"/>
+        <w:rPr>
+          <w:b/>
+          <w:color w:val="767171" w:themeColor="background2" w:themeShade="80"/>
+          <w:sz w:val="28"/>
+          <w:szCs w:val="28"/>
+        </w:rPr>
+      </w:pPr>
+      <w:r>
+        <w:rPr>
+          <w:noProof/>
+        </w:rPr>
+        <w:lastRenderedPageBreak/>
+        <w:drawing>
+          <wp:anchor distT="0" distB="0" distL="114300" distR="114300" simplePos="0" relativeHeight="251660288" behindDoc="0" locked="0" layoutInCell="1" allowOverlap="1" wp14:anchorId="39004EE7" wp14:editId="02ED6236">
+            <wp:simplePos x="0" y="0"/>
+            <wp:positionH relativeFrom="column">
+              <wp:posOffset>2564765</wp:posOffset>
+            </wp:positionH>
+            <wp:positionV relativeFrom="paragraph">
+              <wp:posOffset>440055</wp:posOffset>
+            </wp:positionV>
+            <wp:extent cx="3503930" cy="1896745"/>
+            <wp:effectExtent l="0" t="0" r="1270" b="8255"/>
+            <wp:wrapSquare wrapText="bothSides"/>
+            <wp:docPr id="1701763731" name="Picture 4"/>
+            <wp:cNvGraphicFramePr>
+              <a:graphicFrameLocks xmlns:a="http://schemas.openxmlformats.org/drawingml/2006/main" noChangeAspect="1"/>
+            </wp:cNvGraphicFramePr>
+            <a:graphic xmlns:a="http://schemas.openxmlformats.org/drawingml/2006/main">
+              <a:graphicData uri="http://schemas.openxmlformats.org/drawingml/2006/picture">
+                <pic:pic xmlns:pic="http://schemas.openxmlformats.org/drawingml/2006/picture">
+                  <pic:nvPicPr>
+                    <pic:cNvPr id="0" name="Picture 4"/>
+                    <pic:cNvPicPr>
+                      <a:picLocks noChangeAspect="1" noChangeArrowheads="1"/>
+                    </pic:cNvPicPr>
+                  </pic:nvPicPr>
+                  <pic:blipFill rotWithShape="1">
+                    <a:blip r:embed="rId9">
+                      <a:extLst>
+                        <a:ext uri="{28A0092B-C50C-407E-A947-70E740481C1C}">
+                          <a14:useLocalDpi xmlns:a14="http://schemas.microsoft.com/office/drawing/2010/main" val="0"/>
+                        </a:ext>
+                      </a:extLst>
+                    </a:blip>
+                    <a:srcRect l="7805" t="12632" r="7480" b="14636"/>
+                    <a:stretch/>
+                  </pic:blipFill>
+                  <pic:spPr bwMode="auto">
+                    <a:xfrm>
+                      <a:off x="0" y="0"/>
+                      <a:ext cx="3503930" cy="1896745"/>
+                    </a:xfrm>
+                    <a:prstGeom prst="rect">
+                      <a:avLst/>
+                    </a:prstGeom>
+                    <a:noFill/>
+                    <a:ln>
+                      <a:noFill/>
+                    </a:ln>
+                    <a:extLst>
+                      <a:ext uri="{53640926-AAD7-44D8-BBD7-CCE9431645EC}">
+                        <a14:shadowObscured xmlns:a14="http://schemas.microsoft.com/office/drawing/2010/main"/>
+                      </a:ext>
+                    </a:extLst>
+                  </pic:spPr>
+                </pic:pic>
+              </a:graphicData>
+            </a:graphic>
+            <wp14:sizeRelH relativeFrom="margin">
+              <wp14:pctWidth>0</wp14:pctWidth>
+            </wp14:sizeRelH>
+            <wp14:sizeRelV relativeFrom="margin">
+              <wp14:pctHeight>0</wp14:pctHeight>
+            </wp14:sizeRelV>
+          </wp:anchor>
+        </w:drawing>
+      </w:r>
+      <w:r>
+        <w:rPr>
+          <w:b/>
+          <w:color w:val="767171" w:themeColor="background2" w:themeShade="80"/>
+          <w:sz w:val="28"/>
+          <w:szCs w:val="28"/>
+        </w:rPr>
+        <w:t xml:space="preserve">Implementing </w:t>
+      </w:r>
+      <w:r>
+        <w:rPr>
+          <w:b/>
+          <w:color w:val="767171" w:themeColor="background2" w:themeShade="80"/>
+          <w:sz w:val="28"/>
+          <w:szCs w:val="28"/>
+        </w:rPr>
+        <w:t>Item</w:t>
+      </w:r>
+      <w:r>
+        <w:rPr>
+          <w:b/>
+          <w:color w:val="767171" w:themeColor="background2" w:themeShade="80"/>
+          <w:sz w:val="28"/>
+          <w:szCs w:val="28"/>
+        </w:rPr>
+        <w:t xml:space="preserve"> </w:t>
+      </w:r>
+    </w:p>
+    <w:p>
+      <w:pPr>
+        <w:spacing w:line="360" w:lineRule="auto"/>
+        <w:jc w:val="both"/>
+      </w:pPr>
+      <w:r>
+        <w:rPr>
+          <w:noProof/>
+        </w:rPr>
+        <w:drawing>
+          <wp:anchor distT="0" distB="0" distL="114300" distR="114300" simplePos="0" relativeHeight="251661312" behindDoc="0" locked="0" layoutInCell="1" allowOverlap="1" wp14:anchorId="3278E928" wp14:editId="54073157">
+            <wp:simplePos x="0" y="0"/>
+            <wp:positionH relativeFrom="margin">
+              <wp:align>left</wp:align>
+            </wp:positionH>
+            <wp:positionV relativeFrom="paragraph">
+              <wp:posOffset>111085</wp:posOffset>
+            </wp:positionV>
+            <wp:extent cx="2373549" cy="1916632"/>
+            <wp:effectExtent l="0" t="0" r="8255" b="7620"/>
+            <wp:wrapSquare wrapText="bothSides"/>
+            <wp:docPr id="793700810" name="Picture 5"/>
+            <wp:cNvGraphicFramePr>
+              <a:graphicFrameLocks xmlns:a="http://schemas.openxmlformats.org/drawingml/2006/main" noChangeAspect="1"/>
+            </wp:cNvGraphicFramePr>
+            <a:graphic xmlns:a="http://schemas.openxmlformats.org/drawingml/2006/main">
+              <a:graphicData uri="http://schemas.openxmlformats.org/drawingml/2006/picture">
+                <pic:pic xmlns:pic="http://schemas.openxmlformats.org/drawingml/2006/picture">
+                  <pic:nvPicPr>
+                    <pic:cNvPr id="0" name="Picture 5"/>
+                    <pic:cNvPicPr>
+                      <a:picLocks noChangeAspect="1" noChangeArrowheads="1"/>
+                    </pic:cNvPicPr>
+                  </pic:nvPicPr>
+                  <pic:blipFill rotWithShape="1">
+                    <a:blip r:embed="rId10">
+                      <a:extLst>
+                        <a:ext uri="{28A0092B-C50C-407E-A947-70E740481C1C}">
+                          <a14:useLocalDpi xmlns:a14="http://schemas.microsoft.com/office/drawing/2010/main" val="0"/>
+                        </a:ext>
+                      </a:extLst>
+                    </a:blip>
+                    <a:srcRect l="10191" t="11485" r="8748" b="12393"/>
+                    <a:stretch/>
+                  </pic:blipFill>
+                  <pic:spPr bwMode="auto">
+                    <a:xfrm>
+                      <a:off x="0" y="0"/>
+                      <a:ext cx="2373549" cy="1916632"/>
+                    </a:xfrm>
+                    <a:prstGeom prst="rect">
+                      <a:avLst/>
+                    </a:prstGeom>
+                    <a:noFill/>
+                    <a:ln>
+                      <a:noFill/>
+                    </a:ln>
+                    <a:extLst>
+                      <a:ext uri="{53640926-AAD7-44D8-BBD7-CCE9431645EC}">
+                        <a14:shadowObscured xmlns:a14="http://schemas.microsoft.com/office/drawing/2010/main"/>
+                      </a:ext>
+                    </a:extLst>
+                  </pic:spPr>
+                </pic:pic>
+              </a:graphicData>
+            </a:graphic>
+          </wp:anchor>
+        </w:drawing>
+      </w:r>
+    </w:p>
+    <w:p>
+      <w:pPr>
+        <w:spacing w:line="360" w:lineRule="auto"/>
+        <w:jc w:val="both"/>
+        <w:rPr>
+          <w:noProof/>
+        </w:rPr>
+      </w:pPr>
+    </w:p>
+    <w:p>
+      <w:pPr>
+        <w:spacing w:line="360" w:lineRule="auto"/>
+        <w:jc w:val="both"/>
+        <w:rPr>
+          <w:noProof/>
+        </w:rPr>
+      </w:pPr>
+    </w:p>
+    <w:p>
+      <w:pPr>
+        <w:spacing w:line="360" w:lineRule="auto"/>
+        <w:jc w:val="both"/>
+      </w:pPr>
+    </w:p>
+    <w:p>
+      <w:pPr>
+        <w:spacing w:line="360" w:lineRule="auto"/>
+        <w:jc w:val="both"/>
+      </w:pPr>
+    </w:p>
+    <w:p>
+      <w:pPr>
+        <w:spacing w:line="360" w:lineRule="auto"/>
+        <w:jc w:val="both"/>
+        <w:rPr>
+          <w:b/>
+          <w:color w:val="767171" w:themeColor="background2" w:themeShade="80"/>
+          <w:sz w:val="28"/>
+          <w:szCs w:val="28"/>
+        </w:rPr>
+      </w:pPr>
+      <w:r>
+        <w:rPr>
+          <w:b/>
+          <w:color w:val="767171" w:themeColor="background2" w:themeShade="80"/>
+          <w:sz w:val="28"/>
+          <w:szCs w:val="28"/>
+        </w:rPr>
+        <w:t xml:space="preserve">Testing </w:t>
+      </w:r>
+      <w:r>
+        <w:rPr>
+          <w:b/>
+          <w:color w:val="767171" w:themeColor="background2" w:themeShade="80"/>
+          <w:sz w:val="28"/>
+          <w:szCs w:val="28"/>
+        </w:rPr>
+        <w:t>Outcome</w:t>
+      </w:r>
+    </w:p>
+    <w:p>
+      <w:pPr>
+        <w:spacing w:line="360" w:lineRule="auto"/>
+        <w:jc w:val="both"/>
+        <w:rPr>
+          <w:b/>
+          <w:noProof/>
+          <w:color w:val="767171" w:themeColor="background2" w:themeShade="80"/>
+          <w:sz w:val="28"/>
+          <w:szCs w:val="28"/>
+        </w:rPr>
+      </w:pPr>
+    </w:p>
+    <w:p>
+      <w:pPr>
+        <w:spacing w:line="360" w:lineRule="auto"/>
+        <w:jc w:val="both"/>
+        <w:rPr>
+          <w:b/>
+          <w:color w:val="767171" w:themeColor="background2" w:themeShade="80"/>
+          <w:sz w:val="28"/>
+          <w:szCs w:val="28"/>
+        </w:rPr>
+      </w:pPr>
+      <w:r>
+        <w:rPr>
+          <w:b/>
+          <w:noProof/>
+          <w:color w:val="767171" w:themeColor="background2" w:themeShade="80"/>
+          <w:sz w:val="28"/>
+          <w:szCs w:val="28"/>
+        </w:rPr>
+        <w:drawing>
+          <wp:inline distT="0" distB="0" distL="0" distR="0" wp14:anchorId="269933CD" wp14:editId="0CFA38C8">
+            <wp:extent cx="3171217" cy="2925225"/>
+            <wp:effectExtent l="0" t="0" r="0" b="8890"/>
+            <wp:docPr id="1178889025" name="Picture 6"/>
+            <wp:cNvGraphicFramePr>
+              <a:graphicFrameLocks xmlns:a="http://schemas.openxmlformats.org/drawingml/2006/main" noChangeAspect="1"/>
+            </wp:cNvGraphicFramePr>
+            <a:graphic xmlns:a="http://schemas.openxmlformats.org/drawingml/2006/main">
+              <a:graphicData uri="http://schemas.openxmlformats.org/drawingml/2006/picture">
+                <pic:pic xmlns:pic="http://schemas.openxmlformats.org/drawingml/2006/picture">
+                  <pic:nvPicPr>
+                    <pic:cNvPr id="0" name="Picture 6"/>
+                    <pic:cNvPicPr>
+                      <a:picLocks noChangeAspect="1" noChangeArrowheads="1"/>
+                    </pic:cNvPicPr>
+                  </pic:nvPicPr>
+                  <pic:blipFill rotWithShape="1">
+                    <a:blip r:embed="rId11">
+                      <a:extLst>
+                        <a:ext uri="{28A0092B-C50C-407E-A947-70E740481C1C}">
+                          <a14:useLocalDpi xmlns:a14="http://schemas.microsoft.com/office/drawing/2010/main" val="0"/>
+                        </a:ext>
+                      </a:extLst>
+                    </a:blip>
+                    <a:srcRect l="8122" t="8726" r="7799" b="9553"/>
+                    <a:stretch/>
+                  </pic:blipFill>
+                  <pic:spPr bwMode="auto">
+                    <a:xfrm>
+                      <a:off x="0" y="0"/>
+                      <a:ext cx="3180727" cy="2933997"/>
+                    </a:xfrm>
+                    <a:prstGeom prst="rect">
+                      <a:avLst/>
+                    </a:prstGeom>
+                    <a:noFill/>
+                    <a:ln>
+                      <a:noFill/>
+                    </a:ln>
+                    <a:extLst>
+                      <a:ext uri="{53640926-AAD7-44D8-BBD7-CCE9431645EC}">
+                        <a14:shadowObscured xmlns:a14="http://schemas.microsoft.com/office/drawing/2010/main"/>
+                      </a:ext>
+                    </a:extLst>
+                  </pic:spPr>
+                </pic:pic>
+              </a:graphicData>
+            </a:graphic>
+          </wp:inline>
+        </w:drawing>
+      </w:r>
+    </w:p>
+    <w:p>
+      <w:pPr>
+        <w:spacing w:line="360" w:lineRule="auto"/>
+        <w:jc w:val="both"/>
+      </w:pPr>
+      <w:r>
+        <w:drawing>
+          <wp:inline distT="0" distB="0" distL="0" distR="0" wp14:anchorId="2425E48E" wp14:editId="5CBDEC95">
+            <wp:extent cx="2286319" cy="1714739"/>
+            <wp:effectExtent l="0" t="0" r="0" b="0"/>
+            <wp:docPr id="1896186916" name="Picture 1" descr="A screenshot of a computer&#10;&#10;Description automatically generated"/>
+            <wp:cNvGraphicFramePr>
+              <a:graphicFrameLocks xmlns:a="http://schemas.openxmlformats.org/drawingml/2006/main" noChangeAspect="1"/>
+            </wp:cNvGraphicFramePr>
+            <a:graphic xmlns:a="http://schemas.openxmlformats.org/drawingml/2006/main">
+              <a:graphicData uri="http://schemas.openxmlformats.org/drawingml/2006/picture">
+                <pic:pic xmlns:pic="http://schemas.openxmlformats.org/drawingml/2006/picture">
+                  <pic:nvPicPr>
+                    <pic:cNvPr id="1896186916" name="Picture 1" descr="A screenshot of a computer&#10;&#10;Description automatically generated"/>
+                    <pic:cNvPicPr/>
+                  </pic:nvPicPr>
+                  <pic:blipFill>
+                    <a:blip r:embed="rId12"/>
+                    <a:stretch>
+                      <a:fillRect/>
+                    </a:stretch>
+                  </pic:blipFill>
+                  <pic:spPr>
+                    <a:xfrm>
+                      <a:off x="0" y="0"/>
+                      <a:ext cx="2286319" cy="1714739"/>
+                    </a:xfrm>
+                    <a:prstGeom prst="rect">
+                      <a:avLst/>
+                    </a:prstGeom>
+                  </pic:spPr>
+                </pic:pic>
+              </a:graphicData>
+            </a:graphic>
+          </wp:inline>
+        </w:drawing>
+      </w:r>
     </w:p>
     <w:sectPr>
-      <w:headerReference w:type="default" r:id="rId7"/>
+      <w:headerReference w:type="default" r:id="rId13"/>
       <w:pgSz w:w="11900" w:h="16840"/>
       <w:pgMar w:top="1440" w:right="1134" w:bottom="1440" w:left="1134" w:header="709" w:footer="709" w:gutter="0"/>
       <w:cols w:space="708"/>
@@ -819,6 +1892,119 @@
 <file path=word/numbering.xml><?xml version="1.0" encoding="utf-8"?>
 <w:numbering xmlns:wpc="http://schemas.microsoft.com/office/word/2010/wordprocessingCanvas" xmlns:cx="http://schemas.microsoft.com/office/drawing/2014/chartex" xmlns:cx1="http://schemas.microsoft.com/office/drawing/2015/9/8/chartex" xmlns:cx2="http://schemas.microsoft.com/office/drawing/2015/10/21/chartex" xmlns:cx3="http://schemas.microsoft.com/office/drawing/2016/5/9/chartex" xmlns:cx4="http://schemas.microsoft.com/office/drawing/2016/5/10/chartex" xmlns:cx5="http://schemas.microsoft.com/office/drawing/2016/5/11/chartex" xmlns:cx6="http://schemas.microsoft.com/office/drawing/2016/5/12/chartex" xmlns:cx7="http://schemas.microsoft.com/office/drawing/2016/5/13/chartex" xmlns:cx8="http://schemas.microsoft.com/office/drawing/2016/5/14/chartex" xmlns:mc="http://schemas.openxmlformats.org/markup-compatibility/2006" xmlns:aink="http://schemas.microsoft.com/office/drawing/2016/ink" xmlns:am3d="http://schemas.microsoft.com/office/drawing/2017/model3d" xmlns:o="urn:schemas-microsoft-com:office:office" xmlns:oel="http://schemas.microsoft.com/office/2019/extlst" xmlns:r="http://schemas.openxmlformats.org/officeDocument/2006/relationships" xmlns:m="http://schemas.openxmlformats.org/officeDocument/2006/math" xmlns:v="urn:schemas-microsoft-com:vml" xmlns:wp14="http://schemas.microsoft.com/office/word/2010/wordprocessingDrawing" xmlns:wp="http://schemas.openxmlformats.org/drawingml/2006/wordprocessingDrawing" xmlns:w10="urn:schemas-microsoft-com:office:word" xmlns:w="http://schemas.openxmlformats.org/wordprocessingml/2006/main" xmlns:w14="http://schemas.microsoft.com/office/word/2010/wordml" xmlns:w15="http://schemas.microsoft.com/office/word/2012/wordml" xmlns:w16cex="http://schemas.microsoft.com/office/word/2018/wordml/cex" xmlns:w16cid="http://schemas.microsoft.com/office/word/2016/wordml/cid" xmlns:w16="http://schemas.microsoft.com/office/word/2018/wordml" xmlns:w16sdtdh="http://schemas.microsoft.com/office/word/2020/wordml/sdtdatahash" xmlns:w16se="http://schemas.microsoft.com/office/word/2015/wordml/symex" xmlns:wpg="http://schemas.microsoft.com/office/word/2010/wordprocessingGroup" xmlns:wpi="http://schemas.microsoft.com/office/word/2010/wordprocessingInk" xmlns:wne="http://schemas.microsoft.com/office/word/2006/wordml" xmlns:wps="http://schemas.microsoft.com/office/word/2010/wordprocessingShape" mc:Ignorable="w14 w15 w16se w16cid w16 w16cex w16sdtdh wp14">
   <w:abstractNum w:abstractNumId="0" w15:restartNumberingAfterBreak="0">
+    <w:nsid w:val="0B1F5D97"/>
+    <w:multiLevelType w:val="multilevel"/>
+    <w:tmpl w:val="68D41292"/>
+    <w:lvl w:ilvl="0">
+      <w:start w:val="1"/>
+      <w:numFmt w:val="decimal"/>
+      <w:lvlText w:val="%1."/>
+      <w:lvlJc w:val="left"/>
+      <w:pPr>
+        <w:tabs>
+          <w:tab w:val="num" w:pos="720"/>
+        </w:tabs>
+        <w:ind w:left="720" w:hanging="360"/>
+      </w:pPr>
+    </w:lvl>
+    <w:lvl w:ilvl="1" w:tentative="1">
+      <w:start w:val="1"/>
+      <w:numFmt w:val="decimal"/>
+      <w:lvlText w:val="%2."/>
+      <w:lvlJc w:val="left"/>
+      <w:pPr>
+        <w:tabs>
+          <w:tab w:val="num" w:pos="1440"/>
+        </w:tabs>
+        <w:ind w:left="1440" w:hanging="360"/>
+      </w:pPr>
+    </w:lvl>
+    <w:lvl w:ilvl="2" w:tentative="1">
+      <w:start w:val="1"/>
+      <w:numFmt w:val="decimal"/>
+      <w:lvlText w:val="%3."/>
+      <w:lvlJc w:val="left"/>
+      <w:pPr>
+        <w:tabs>
+          <w:tab w:val="num" w:pos="2160"/>
+        </w:tabs>
+        <w:ind w:left="2160" w:hanging="360"/>
+      </w:pPr>
+    </w:lvl>
+    <w:lvl w:ilvl="3" w:tentative="1">
+      <w:start w:val="1"/>
+      <w:numFmt w:val="decimal"/>
+      <w:lvlText w:val="%4."/>
+      <w:lvlJc w:val="left"/>
+      <w:pPr>
+        <w:tabs>
+          <w:tab w:val="num" w:pos="2880"/>
+        </w:tabs>
+        <w:ind w:left="2880" w:hanging="360"/>
+      </w:pPr>
+    </w:lvl>
+    <w:lvl w:ilvl="4" w:tentative="1">
+      <w:start w:val="1"/>
+      <w:numFmt w:val="decimal"/>
+      <w:lvlText w:val="%5."/>
+      <w:lvlJc w:val="left"/>
+      <w:pPr>
+        <w:tabs>
+          <w:tab w:val="num" w:pos="3600"/>
+        </w:tabs>
+        <w:ind w:left="3600" w:hanging="360"/>
+      </w:pPr>
+    </w:lvl>
+    <w:lvl w:ilvl="5" w:tentative="1">
+      <w:start w:val="1"/>
+      <w:numFmt w:val="decimal"/>
+      <w:lvlText w:val="%6."/>
+      <w:lvlJc w:val="left"/>
+      <w:pPr>
+        <w:tabs>
+          <w:tab w:val="num" w:pos="4320"/>
+        </w:tabs>
+        <w:ind w:left="4320" w:hanging="360"/>
+      </w:pPr>
+    </w:lvl>
+    <w:lvl w:ilvl="6" w:tentative="1">
+      <w:start w:val="1"/>
+      <w:numFmt w:val="decimal"/>
+      <w:lvlText w:val="%7."/>
+      <w:lvlJc w:val="left"/>
+      <w:pPr>
+        <w:tabs>
+          <w:tab w:val="num" w:pos="5040"/>
+        </w:tabs>
+        <w:ind w:left="5040" w:hanging="360"/>
+      </w:pPr>
+    </w:lvl>
+    <w:lvl w:ilvl="7" w:tentative="1">
+      <w:start w:val="1"/>
+      <w:numFmt w:val="decimal"/>
+      <w:lvlText w:val="%8."/>
+      <w:lvlJc w:val="left"/>
+      <w:pPr>
+        <w:tabs>
+          <w:tab w:val="num" w:pos="5760"/>
+        </w:tabs>
+        <w:ind w:left="5760" w:hanging="360"/>
+      </w:pPr>
+    </w:lvl>
+    <w:lvl w:ilvl="8" w:tentative="1">
+      <w:start w:val="1"/>
+      <w:numFmt w:val="decimal"/>
+      <w:lvlText w:val="%9."/>
+      <w:lvlJc w:val="left"/>
+      <w:pPr>
+        <w:tabs>
+          <w:tab w:val="num" w:pos="6480"/>
+        </w:tabs>
+        <w:ind w:left="6480" w:hanging="360"/>
+      </w:pPr>
+    </w:lvl>
+  </w:abstractNum>
+  <w:abstractNum w:abstractNumId="1" w15:restartNumberingAfterBreak="0">
     <w:nsid w:val="3BFA2C2D"/>
     <w:multiLevelType w:val="hybridMultilevel"/>
     <w:tmpl w:val="F8A0C330"/>
@@ -931,7 +2117,7 @@
       </w:rPr>
     </w:lvl>
   </w:abstractNum>
-  <w:abstractNum w:abstractNumId="1" w15:restartNumberingAfterBreak="0">
+  <w:abstractNum w:abstractNumId="2" w15:restartNumberingAfterBreak="0">
     <w:nsid w:val="5A1B13A5"/>
     <w:multiLevelType w:val="multilevel"/>
     <w:tmpl w:val="905EE156"/>
@@ -1080,7 +2266,7 @@
       </w:rPr>
     </w:lvl>
   </w:abstractNum>
-  <w:abstractNum w:abstractNumId="2" w15:restartNumberingAfterBreak="0">
+  <w:abstractNum w:abstractNumId="3" w15:restartNumberingAfterBreak="0">
     <w:nsid w:val="7ACB05C1"/>
     <w:multiLevelType w:val="hybridMultilevel"/>
     <w:tmpl w:val="616E4C48"/>
@@ -1194,13 +2380,16 @@
     </w:lvl>
   </w:abstractNum>
   <w:num w:numId="1" w16cid:durableId="1156150151">
+    <w:abstractNumId w:val="3"/>
+  </w:num>
+  <w:num w:numId="2" w16cid:durableId="1359355386">
+    <w:abstractNumId w:val="1"/>
+  </w:num>
+  <w:num w:numId="3" w16cid:durableId="762144661">
     <w:abstractNumId w:val="2"/>
   </w:num>
-  <w:num w:numId="2" w16cid:durableId="1359355386">
+  <w:num w:numId="4" w16cid:durableId="1767075481">
     <w:abstractNumId w:val="0"/>
-  </w:num>
-  <w:num w:numId="3" w16cid:durableId="762144661">
-    <w:abstractNumId w:val="1"/>
   </w:num>
 </w:numbering>
 </file>

</xml_diff>

<commit_message>
Inital Task 10 setup + Data header file creation
</commit_message>
<xml_diff>
--- a/09 - Spike - Game Data Structures/Task 09 - Lab Spike Report.docx
+++ b/09 - Spike - Game Data Structures/Task 09 - Lab Spike Report.docx
@@ -140,7 +140,25 @@
           <w:sz w:val="24"/>
           <w:szCs w:val="24"/>
         </w:rPr>
-        <w:t>The goal of this spike task is to demonstrate my ability to collect and analyse software performance data while applying my knowledge in comparing and evaluating functions, IDE and complier settings.</w:t>
+        <w:t xml:space="preserve">The goal of this spike task is to demonstrate my ability to collect and analyse software performance data while applying my knowledge in comparing and evaluating functions, </w:t>
+      </w:r>
+      <w:proofErr w:type="gramStart"/>
+      <w:r>
+        <w:rPr>
+          <w:rStyle w:val="SubtleReference"/>
+          <w:sz w:val="24"/>
+          <w:szCs w:val="24"/>
+        </w:rPr>
+        <w:t>IDE</w:t>
+      </w:r>
+      <w:proofErr w:type="gramEnd"/>
+      <w:r>
+        <w:rPr>
+          <w:rStyle w:val="SubtleReference"/>
+          <w:sz w:val="24"/>
+          <w:szCs w:val="24"/>
+        </w:rPr>
+        <w:t xml:space="preserve"> and complier settings.</w:t>
       </w:r>
     </w:p>
     <w:p>
@@ -231,7 +249,7 @@
           <w:sz w:val="24"/>
           <w:szCs w:val="24"/>
         </w:rPr>
-        <w:t>C:\Users\storm\Documents\GitHub\GAMES PROGRAMMING REPO\COS30031-2023-102608927\08 - Spike - Game State Management\</w:t>
+        <w:t>C:\Users\storm\Documents\GitHub\GAMES PROGRAMMING REPO\COS30031-2023-102608927\09 - Spike - Game Data Structures\</w:t>
       </w:r>
       <w:proofErr w:type="spellStart"/>
       <w:r>
@@ -240,7 +258,7 @@
           <w:sz w:val="24"/>
           <w:szCs w:val="24"/>
         </w:rPr>
-        <w:t>Zorkish</w:t>
+        <w:t>InventorySystem</w:t>
       </w:r>
       <w:proofErr w:type="spellEnd"/>
       <w:r>
@@ -258,7 +276,7 @@
           <w:sz w:val="24"/>
           <w:szCs w:val="24"/>
         </w:rPr>
-        <w:t>Zorkish</w:t>
+        <w:t>InventorySystem</w:t>
       </w:r>
       <w:proofErr w:type="spellEnd"/>
     </w:p>
@@ -1616,8 +1634,65 @@
         <w:jc w:val="both"/>
         <w:rPr>
           <w:noProof/>
-        </w:rPr>
-      </w:pPr>
+          <w:sz w:val="24"/>
+          <w:szCs w:val="32"/>
+          <w:lang w:val="en-US"/>
+        </w:rPr>
+      </w:pPr>
+      <w:r>
+        <w:rPr>
+          <w:noProof/>
+          <w:sz w:val="24"/>
+          <w:szCs w:val="32"/>
+          <w:lang w:val="en-US"/>
+        </w:rPr>
+        <w:t xml:space="preserve">Item class represents individual </w:t>
+      </w:r>
+      <w:r>
+        <w:rPr>
+          <w:noProof/>
+          <w:sz w:val="24"/>
+          <w:szCs w:val="32"/>
+          <w:lang w:val="en-US"/>
+        </w:rPr>
+        <w:t xml:space="preserve">item </w:t>
+      </w:r>
+      <w:r>
+        <w:rPr>
+          <w:noProof/>
+          <w:sz w:val="24"/>
+          <w:szCs w:val="32"/>
+          <w:lang w:val="en-US"/>
+        </w:rPr>
+        <w:t xml:space="preserve">objects that can be added to or removed from the inventory. Each item </w:t>
+      </w:r>
+      <w:r>
+        <w:rPr>
+          <w:noProof/>
+          <w:sz w:val="24"/>
+          <w:szCs w:val="32"/>
+          <w:lang w:val="en-US"/>
+        </w:rPr>
+        <w:t>uses an</w:t>
+      </w:r>
+      <w:r>
+        <w:rPr>
+          <w:noProof/>
+          <w:sz w:val="24"/>
+          <w:szCs w:val="32"/>
+          <w:lang w:val="en-US"/>
+        </w:rPr>
+        <w:t xml:space="preserve"> attribute such as a name</w:t>
+      </w:r>
+      <w:r>
+        <w:rPr>
+          <w:noProof/>
+          <w:sz w:val="24"/>
+          <w:szCs w:val="32"/>
+          <w:lang w:val="en-US"/>
+        </w:rPr>
+        <w:t xml:space="preserve"> to identify the item.</w:t>
+      </w:r>
     </w:p>
     <w:p>
       <w:pPr>
@@ -1625,14 +1700,157 @@
         <w:jc w:val="both"/>
         <w:rPr>
           <w:noProof/>
-        </w:rPr>
-      </w:pPr>
-    </w:p>
-    <w:p>
-      <w:pPr>
+          <w:sz w:val="24"/>
+          <w:szCs w:val="32"/>
+          <w:lang w:val="en-US"/>
+        </w:rPr>
+      </w:pPr>
+      <w:r>
+        <w:rPr>
+          <w:b/>
+          <w:bCs/>
+          <w:noProof/>
+          <w:sz w:val="24"/>
+          <w:szCs w:val="32"/>
+          <w:lang w:val="en-US"/>
+        </w:rPr>
+        <w:t xml:space="preserve">Item </w:t>
+      </w:r>
+      <w:r>
+        <w:rPr>
+          <w:b/>
+          <w:bCs/>
+          <w:noProof/>
+          <w:sz w:val="24"/>
+          <w:szCs w:val="32"/>
+          <w:lang w:val="en-US"/>
+        </w:rPr>
+        <w:t>Header</w:t>
+      </w:r>
+      <w:r>
+        <w:rPr>
+          <w:b/>
+          <w:bCs/>
+          <w:noProof/>
+          <w:sz w:val="24"/>
+          <w:szCs w:val="32"/>
+          <w:lang w:val="en-US"/>
+        </w:rPr>
+        <w:t xml:space="preserve"> File</w:t>
+      </w:r>
+      <w:r>
+        <w:rPr>
+          <w:b/>
+          <w:bCs/>
+          <w:noProof/>
+          <w:sz w:val="24"/>
+          <w:szCs w:val="32"/>
+          <w:lang w:val="en-US"/>
+        </w:rPr>
+        <w:t>:</w:t>
+      </w:r>
+      <w:r>
+        <w:rPr>
+          <w:noProof/>
+          <w:sz w:val="24"/>
+          <w:szCs w:val="32"/>
+          <w:lang w:val="en-US"/>
+        </w:rPr>
+        <w:t xml:space="preserve"> The </w:t>
+      </w:r>
+      <w:r>
+        <w:rPr>
+          <w:noProof/>
+          <w:sz w:val="24"/>
+          <w:szCs w:val="32"/>
+          <w:lang w:val="en-US"/>
+        </w:rPr>
+        <w:t xml:space="preserve">item </w:t>
+      </w:r>
+      <w:r>
+        <w:rPr>
+          <w:noProof/>
+          <w:sz w:val="24"/>
+          <w:szCs w:val="32"/>
+          <w:lang w:val="en-US"/>
+        </w:rPr>
+        <w:t>header file for the Item class outlines methods associated with individual items. Some fundamental methods and properties are:</w:t>
+      </w:r>
+    </w:p>
+    <w:p>
+      <w:pPr>
+        <w:numPr>
+          <w:ilvl w:val="0"/>
+          <w:numId w:val="6"/>
+        </w:numPr>
         <w:spacing w:line="360" w:lineRule="auto"/>
         <w:jc w:val="both"/>
-      </w:pPr>
+        <w:rPr>
+          <w:noProof/>
+          <w:sz w:val="24"/>
+          <w:szCs w:val="32"/>
+          <w:lang w:val="en-US"/>
+        </w:rPr>
+      </w:pPr>
+      <w:r>
+        <w:rPr>
+          <w:noProof/>
+          <w:sz w:val="24"/>
+          <w:szCs w:val="32"/>
+          <w:lang w:val="en-US"/>
+        </w:rPr>
+        <w:t>A constructor to initialize an item with specific attributes.</w:t>
+      </w:r>
+    </w:p>
+    <w:p>
+      <w:pPr>
+        <w:numPr>
+          <w:ilvl w:val="0"/>
+          <w:numId w:val="6"/>
+        </w:numPr>
+        <w:spacing w:line="360" w:lineRule="auto"/>
+        <w:jc w:val="both"/>
+        <w:rPr>
+          <w:noProof/>
+          <w:sz w:val="24"/>
+          <w:szCs w:val="32"/>
+          <w:lang w:val="en-US"/>
+        </w:rPr>
+      </w:pPr>
+      <w:r>
+        <w:rPr>
+          <w:noProof/>
+          <w:sz w:val="24"/>
+          <w:szCs w:val="32"/>
+          <w:lang w:val="en-US"/>
+        </w:rPr>
+        <w:t>Getter and Setter methods for each attribute.</w:t>
+      </w:r>
+    </w:p>
+    <w:p>
+      <w:pPr>
+        <w:numPr>
+          <w:ilvl w:val="0"/>
+          <w:numId w:val="6"/>
+        </w:numPr>
+        <w:spacing w:line="360" w:lineRule="auto"/>
+        <w:jc w:val="both"/>
+        <w:rPr>
+          <w:noProof/>
+          <w:sz w:val="24"/>
+          <w:szCs w:val="32"/>
+          <w:lang w:val="en-US"/>
+        </w:rPr>
+      </w:pPr>
+      <w:r>
+        <w:rPr>
+          <w:noProof/>
+          <w:sz w:val="24"/>
+          <w:szCs w:val="32"/>
+          <w:lang w:val="en-US"/>
+        </w:rPr>
+        <w:t>Perhaps methods that dictate how the item interacts with other game elements or the environment.</w:t>
+      </w:r>
     </w:p>
     <w:p>
       <w:pPr>
@@ -1675,37 +1893,32 @@
         <w:spacing w:line="360" w:lineRule="auto"/>
         <w:jc w:val="both"/>
         <w:rPr>
+          <w:bCs/>
+          <w:noProof/>
+          <w:color w:val="000000" w:themeColor="text1"/>
+          <w:sz w:val="24"/>
+        </w:rPr>
+      </w:pPr>
+      <w:r>
+        <w:rPr>
           <w:b/>
           <w:noProof/>
           <w:color w:val="767171" w:themeColor="background2" w:themeShade="80"/>
           <w:sz w:val="28"/>
           <w:szCs w:val="28"/>
         </w:rPr>
-      </w:pPr>
-    </w:p>
-    <w:p>
-      <w:pPr>
-        <w:spacing w:line="360" w:lineRule="auto"/>
-        <w:jc w:val="both"/>
-        <w:rPr>
-          <w:b/>
-          <w:color w:val="767171" w:themeColor="background2" w:themeShade="80"/>
-          <w:sz w:val="28"/>
-          <w:szCs w:val="28"/>
-        </w:rPr>
-      </w:pPr>
-      <w:r>
-        <w:rPr>
-          <w:b/>
-          <w:noProof/>
-          <w:color w:val="767171" w:themeColor="background2" w:themeShade="80"/>
-          <w:sz w:val="28"/>
-          <w:szCs w:val="28"/>
-        </w:rPr>
         <w:drawing>
-          <wp:inline distT="0" distB="0" distL="0" distR="0" wp14:anchorId="269933CD" wp14:editId="0CFA38C8">
-            <wp:extent cx="3171217" cy="2925225"/>
-            <wp:effectExtent l="0" t="0" r="0" b="8890"/>
+          <wp:anchor distT="0" distB="0" distL="114300" distR="114300" simplePos="0" relativeHeight="251662336" behindDoc="0" locked="0" layoutInCell="1" allowOverlap="1" wp14:anchorId="269933CD" wp14:editId="5B993366">
+            <wp:simplePos x="0" y="0"/>
+            <wp:positionH relativeFrom="margin">
+              <wp:posOffset>3443591</wp:posOffset>
+            </wp:positionH>
+            <wp:positionV relativeFrom="paragraph">
+              <wp:posOffset>5351</wp:posOffset>
+            </wp:positionV>
+            <wp:extent cx="2733040" cy="2520950"/>
+            <wp:effectExtent l="0" t="0" r="0" b="0"/>
+            <wp:wrapSquare wrapText="bothSides"/>
             <wp:docPr id="1178889025" name="Picture 6"/>
             <wp:cNvGraphicFramePr>
               <a:graphicFrameLocks xmlns:a="http://schemas.openxmlformats.org/drawingml/2006/main" noChangeAspect="1"/>
@@ -1733,7 +1946,7 @@
                   <pic:spPr bwMode="auto">
                     <a:xfrm>
                       <a:off x="0" y="0"/>
-                      <a:ext cx="3180727" cy="2933997"/>
+                      <a:ext cx="2733040" cy="2520950"/>
                     </a:xfrm>
                     <a:prstGeom prst="rect">
                       <a:avLst/>
@@ -1751,20 +1964,49 @@
                 </pic:pic>
               </a:graphicData>
             </a:graphic>
-          </wp:inline>
+            <wp14:sizeRelH relativeFrom="margin">
+              <wp14:pctWidth>0</wp14:pctWidth>
+            </wp14:sizeRelH>
+            <wp14:sizeRelV relativeFrom="margin">
+              <wp14:pctHeight>0</wp14:pctHeight>
+            </wp14:sizeRelV>
+          </wp:anchor>
         </w:drawing>
       </w:r>
+      <w:r>
+        <w:rPr>
+          <w:bCs/>
+          <w:noProof/>
+          <w:color w:val="000000" w:themeColor="text1"/>
+          <w:sz w:val="24"/>
+        </w:rPr>
+        <w:t>Once the Inventory class and Item class has been created, we did some testing in main where we created 3 items a sword, sheild and potion in which we added them to the inventory and then displayed then, after that we remove potion from the inventory and displayed the inventory again and it shows that the potion was removed from the inventory in real time.</w:t>
+      </w:r>
     </w:p>
     <w:p>
       <w:pPr>
         <w:spacing w:line="360" w:lineRule="auto"/>
         <w:jc w:val="both"/>
+        <w:rPr>
+          <w:b/>
+          <w:color w:val="767171" w:themeColor="background2" w:themeShade="80"/>
+          <w:sz w:val="28"/>
+          <w:szCs w:val="28"/>
+        </w:rPr>
       </w:pPr>
       <w:r>
         <w:drawing>
-          <wp:inline distT="0" distB="0" distL="0" distR="0" wp14:anchorId="2425E48E" wp14:editId="5CBDEC95">
-            <wp:extent cx="2286319" cy="1714739"/>
-            <wp:effectExtent l="0" t="0" r="0" b="0"/>
+          <wp:anchor distT="0" distB="0" distL="114300" distR="114300" simplePos="0" relativeHeight="251663360" behindDoc="0" locked="0" layoutInCell="1" allowOverlap="1" wp14:anchorId="2425E48E" wp14:editId="38AAB697">
+            <wp:simplePos x="0" y="0"/>
+            <wp:positionH relativeFrom="margin">
+              <wp:posOffset>-635</wp:posOffset>
+            </wp:positionH>
+            <wp:positionV relativeFrom="paragraph">
+              <wp:posOffset>15240</wp:posOffset>
+            </wp:positionV>
+            <wp:extent cx="1955165" cy="1466215"/>
+            <wp:effectExtent l="0" t="0" r="6985" b="635"/>
+            <wp:wrapSquare wrapText="bothSides"/>
             <wp:docPr id="1896186916" name="Picture 1" descr="A screenshot of a computer&#10;&#10;Description automatically generated"/>
             <wp:cNvGraphicFramePr>
               <a:graphicFrameLocks xmlns:a="http://schemas.openxmlformats.org/drawingml/2006/main" noChangeAspect="1"/>
@@ -1785,7 +2027,7 @@
                   <pic:spPr>
                     <a:xfrm>
                       <a:off x="0" y="0"/>
-                      <a:ext cx="2286319" cy="1714739"/>
+                      <a:ext cx="1955165" cy="1466215"/>
                     </a:xfrm>
                     <a:prstGeom prst="rect">
                       <a:avLst/>
@@ -1794,9 +2036,21 @@
                 </pic:pic>
               </a:graphicData>
             </a:graphic>
-          </wp:inline>
+            <wp14:sizeRelH relativeFrom="margin">
+              <wp14:pctWidth>0</wp14:pctWidth>
+            </wp14:sizeRelH>
+            <wp14:sizeRelV relativeFrom="margin">
+              <wp14:pctHeight>0</wp14:pctHeight>
+            </wp14:sizeRelV>
+          </wp:anchor>
         </w:drawing>
       </w:r>
+    </w:p>
+    <w:p>
+      <w:pPr>
+        <w:spacing w:line="360" w:lineRule="auto"/>
+        <w:jc w:val="both"/>
+      </w:pPr>
     </w:p>
     <w:sectPr>
       <w:headerReference w:type="default" r:id="rId13"/>
@@ -2005,6 +2259,119 @@
     </w:lvl>
   </w:abstractNum>
   <w:abstractNum w:abstractNumId="1" w15:restartNumberingAfterBreak="0">
+    <w:nsid w:val="13B37C12"/>
+    <w:multiLevelType w:val="multilevel"/>
+    <w:tmpl w:val="3196A8F2"/>
+    <w:lvl w:ilvl="0">
+      <w:start w:val="1"/>
+      <w:numFmt w:val="decimal"/>
+      <w:lvlText w:val="%1."/>
+      <w:lvlJc w:val="left"/>
+      <w:pPr>
+        <w:tabs>
+          <w:tab w:val="num" w:pos="720"/>
+        </w:tabs>
+        <w:ind w:left="720" w:hanging="360"/>
+      </w:pPr>
+    </w:lvl>
+    <w:lvl w:ilvl="1" w:tentative="1">
+      <w:start w:val="1"/>
+      <w:numFmt w:val="decimal"/>
+      <w:lvlText w:val="%2."/>
+      <w:lvlJc w:val="left"/>
+      <w:pPr>
+        <w:tabs>
+          <w:tab w:val="num" w:pos="1440"/>
+        </w:tabs>
+        <w:ind w:left="1440" w:hanging="360"/>
+      </w:pPr>
+    </w:lvl>
+    <w:lvl w:ilvl="2" w:tentative="1">
+      <w:start w:val="1"/>
+      <w:numFmt w:val="decimal"/>
+      <w:lvlText w:val="%3."/>
+      <w:lvlJc w:val="left"/>
+      <w:pPr>
+        <w:tabs>
+          <w:tab w:val="num" w:pos="2160"/>
+        </w:tabs>
+        <w:ind w:left="2160" w:hanging="360"/>
+      </w:pPr>
+    </w:lvl>
+    <w:lvl w:ilvl="3" w:tentative="1">
+      <w:start w:val="1"/>
+      <w:numFmt w:val="decimal"/>
+      <w:lvlText w:val="%4."/>
+      <w:lvlJc w:val="left"/>
+      <w:pPr>
+        <w:tabs>
+          <w:tab w:val="num" w:pos="2880"/>
+        </w:tabs>
+        <w:ind w:left="2880" w:hanging="360"/>
+      </w:pPr>
+    </w:lvl>
+    <w:lvl w:ilvl="4" w:tentative="1">
+      <w:start w:val="1"/>
+      <w:numFmt w:val="decimal"/>
+      <w:lvlText w:val="%5."/>
+      <w:lvlJc w:val="left"/>
+      <w:pPr>
+        <w:tabs>
+          <w:tab w:val="num" w:pos="3600"/>
+        </w:tabs>
+        <w:ind w:left="3600" w:hanging="360"/>
+      </w:pPr>
+    </w:lvl>
+    <w:lvl w:ilvl="5" w:tentative="1">
+      <w:start w:val="1"/>
+      <w:numFmt w:val="decimal"/>
+      <w:lvlText w:val="%6."/>
+      <w:lvlJc w:val="left"/>
+      <w:pPr>
+        <w:tabs>
+          <w:tab w:val="num" w:pos="4320"/>
+        </w:tabs>
+        <w:ind w:left="4320" w:hanging="360"/>
+      </w:pPr>
+    </w:lvl>
+    <w:lvl w:ilvl="6" w:tentative="1">
+      <w:start w:val="1"/>
+      <w:numFmt w:val="decimal"/>
+      <w:lvlText w:val="%7."/>
+      <w:lvlJc w:val="left"/>
+      <w:pPr>
+        <w:tabs>
+          <w:tab w:val="num" w:pos="5040"/>
+        </w:tabs>
+        <w:ind w:left="5040" w:hanging="360"/>
+      </w:pPr>
+    </w:lvl>
+    <w:lvl w:ilvl="7" w:tentative="1">
+      <w:start w:val="1"/>
+      <w:numFmt w:val="decimal"/>
+      <w:lvlText w:val="%8."/>
+      <w:lvlJc w:val="left"/>
+      <w:pPr>
+        <w:tabs>
+          <w:tab w:val="num" w:pos="5760"/>
+        </w:tabs>
+        <w:ind w:left="5760" w:hanging="360"/>
+      </w:pPr>
+    </w:lvl>
+    <w:lvl w:ilvl="8" w:tentative="1">
+      <w:start w:val="1"/>
+      <w:numFmt w:val="decimal"/>
+      <w:lvlText w:val="%9."/>
+      <w:lvlJc w:val="left"/>
+      <w:pPr>
+        <w:tabs>
+          <w:tab w:val="num" w:pos="6480"/>
+        </w:tabs>
+        <w:ind w:left="6480" w:hanging="360"/>
+      </w:pPr>
+    </w:lvl>
+  </w:abstractNum>
+  <w:abstractNum w:abstractNumId="2" w15:restartNumberingAfterBreak="0">
     <w:nsid w:val="3BFA2C2D"/>
     <w:multiLevelType w:val="hybridMultilevel"/>
     <w:tmpl w:val="F8A0C330"/>
@@ -2117,7 +2484,120 @@
       </w:rPr>
     </w:lvl>
   </w:abstractNum>
-  <w:abstractNum w:abstractNumId="2" w15:restartNumberingAfterBreak="0">
+  <w:abstractNum w:abstractNumId="3" w15:restartNumberingAfterBreak="0">
+    <w:nsid w:val="4DB153A2"/>
+    <w:multiLevelType w:val="multilevel"/>
+    <w:tmpl w:val="865AB6C4"/>
+    <w:lvl w:ilvl="0">
+      <w:start w:val="1"/>
+      <w:numFmt w:val="decimal"/>
+      <w:lvlText w:val="%1."/>
+      <w:lvlJc w:val="left"/>
+      <w:pPr>
+        <w:tabs>
+          <w:tab w:val="num" w:pos="720"/>
+        </w:tabs>
+        <w:ind w:left="720" w:hanging="360"/>
+      </w:pPr>
+    </w:lvl>
+    <w:lvl w:ilvl="1" w:tentative="1">
+      <w:start w:val="1"/>
+      <w:numFmt w:val="decimal"/>
+      <w:lvlText w:val="%2."/>
+      <w:lvlJc w:val="left"/>
+      <w:pPr>
+        <w:tabs>
+          <w:tab w:val="num" w:pos="1440"/>
+        </w:tabs>
+        <w:ind w:left="1440" w:hanging="360"/>
+      </w:pPr>
+    </w:lvl>
+    <w:lvl w:ilvl="2" w:tentative="1">
+      <w:start w:val="1"/>
+      <w:numFmt w:val="decimal"/>
+      <w:lvlText w:val="%3."/>
+      <w:lvlJc w:val="left"/>
+      <w:pPr>
+        <w:tabs>
+          <w:tab w:val="num" w:pos="2160"/>
+        </w:tabs>
+        <w:ind w:left="2160" w:hanging="360"/>
+      </w:pPr>
+    </w:lvl>
+    <w:lvl w:ilvl="3" w:tentative="1">
+      <w:start w:val="1"/>
+      <w:numFmt w:val="decimal"/>
+      <w:lvlText w:val="%4."/>
+      <w:lvlJc w:val="left"/>
+      <w:pPr>
+        <w:tabs>
+          <w:tab w:val="num" w:pos="2880"/>
+        </w:tabs>
+        <w:ind w:left="2880" w:hanging="360"/>
+      </w:pPr>
+    </w:lvl>
+    <w:lvl w:ilvl="4" w:tentative="1">
+      <w:start w:val="1"/>
+      <w:numFmt w:val="decimal"/>
+      <w:lvlText w:val="%5."/>
+      <w:lvlJc w:val="left"/>
+      <w:pPr>
+        <w:tabs>
+          <w:tab w:val="num" w:pos="3600"/>
+        </w:tabs>
+        <w:ind w:left="3600" w:hanging="360"/>
+      </w:pPr>
+    </w:lvl>
+    <w:lvl w:ilvl="5" w:tentative="1">
+      <w:start w:val="1"/>
+      <w:numFmt w:val="decimal"/>
+      <w:lvlText w:val="%6."/>
+      <w:lvlJc w:val="left"/>
+      <w:pPr>
+        <w:tabs>
+          <w:tab w:val="num" w:pos="4320"/>
+        </w:tabs>
+        <w:ind w:left="4320" w:hanging="360"/>
+      </w:pPr>
+    </w:lvl>
+    <w:lvl w:ilvl="6" w:tentative="1">
+      <w:start w:val="1"/>
+      <w:numFmt w:val="decimal"/>
+      <w:lvlText w:val="%7."/>
+      <w:lvlJc w:val="left"/>
+      <w:pPr>
+        <w:tabs>
+          <w:tab w:val="num" w:pos="5040"/>
+        </w:tabs>
+        <w:ind w:left="5040" w:hanging="360"/>
+      </w:pPr>
+    </w:lvl>
+    <w:lvl w:ilvl="7" w:tentative="1">
+      <w:start w:val="1"/>
+      <w:numFmt w:val="decimal"/>
+      <w:lvlText w:val="%8."/>
+      <w:lvlJc w:val="left"/>
+      <w:pPr>
+        <w:tabs>
+          <w:tab w:val="num" w:pos="5760"/>
+        </w:tabs>
+        <w:ind w:left="5760" w:hanging="360"/>
+      </w:pPr>
+    </w:lvl>
+    <w:lvl w:ilvl="8" w:tentative="1">
+      <w:start w:val="1"/>
+      <w:numFmt w:val="decimal"/>
+      <w:lvlText w:val="%9."/>
+      <w:lvlJc w:val="left"/>
+      <w:pPr>
+        <w:tabs>
+          <w:tab w:val="num" w:pos="6480"/>
+        </w:tabs>
+        <w:ind w:left="6480" w:hanging="360"/>
+      </w:pPr>
+    </w:lvl>
+  </w:abstractNum>
+  <w:abstractNum w:abstractNumId="4" w15:restartNumberingAfterBreak="0">
     <w:nsid w:val="5A1B13A5"/>
     <w:multiLevelType w:val="multilevel"/>
     <w:tmpl w:val="905EE156"/>
@@ -2266,7 +2746,7 @@
       </w:rPr>
     </w:lvl>
   </w:abstractNum>
-  <w:abstractNum w:abstractNumId="3" w15:restartNumberingAfterBreak="0">
+  <w:abstractNum w:abstractNumId="5" w15:restartNumberingAfterBreak="0">
     <w:nsid w:val="7ACB05C1"/>
     <w:multiLevelType w:val="hybridMultilevel"/>
     <w:tmpl w:val="616E4C48"/>
@@ -2380,16 +2860,22 @@
     </w:lvl>
   </w:abstractNum>
   <w:num w:numId="1" w16cid:durableId="1156150151">
-    <w:abstractNumId w:val="3"/>
+    <w:abstractNumId w:val="5"/>
   </w:num>
   <w:num w:numId="2" w16cid:durableId="1359355386">
-    <w:abstractNumId w:val="1"/>
+    <w:abstractNumId w:val="2"/>
   </w:num>
   <w:num w:numId="3" w16cid:durableId="762144661">
-    <w:abstractNumId w:val="2"/>
+    <w:abstractNumId w:val="4"/>
   </w:num>
   <w:num w:numId="4" w16cid:durableId="1767075481">
     <w:abstractNumId w:val="0"/>
+  </w:num>
+  <w:num w:numId="5" w16cid:durableId="1775785777">
+    <w:abstractNumId w:val="1"/>
+  </w:num>
+  <w:num w:numId="6" w16cid:durableId="341711697">
+    <w:abstractNumId w:val="3"/>
   </w:num>
 </w:numbering>
 </file>

</xml_diff>